<commit_message>
docs(91): add licensing & security compliance review (GLM MIT · colibri Apache-2.0)
- GLM-5.2 weights: standard MIT (verified via HF zai-org/GLM-5.2/LICENSE),
  colibri engine: Apache-2.0. No license "issuance"/gating needed.
- Analyze security posture: self-host/air-gap = no data egress (strength),
  and the real compliance gates beyond the license text: China origin policy,
  no-warranty/no-indemnity (AS IS), weight-integrity/behavioral audit.
- Provide MoE-only alternatives if origin is a blocker (gpt-oss Apache/MoE).
- Wire docs/91 into report build (Part 8) + README TOC; rebuild DOCX
  (re-installed puppeteer chrome-headless-shell; all 17 mermaid diagrams embedded).

Co-authored-by: Cursor <cursoragent@cursor.com>
</commit_message>
<xml_diff>
--- a/report/Colibri_Survey_Report.docx
+++ b/report/Colibri_Survey_Report.docx
@@ -32929,22 +32929,22 @@
     <w:bookmarkEnd w:id="323"/>
     <w:bookmarkEnd w:id="324"/>
     <w:bookmarkEnd w:id="325"/>
-    <w:bookmarkStart w:id="340" w:name="제8부-상태마감참고문헌"/>
+    <w:bookmarkStart w:id="351" w:name="제8부-라이선스상태마감참고문헌"/>
     <w:p>
       <w:pPr>
         <w:pStyle w:val="Heading1"/>
       </w:pPr>
       <w:r>
-        <w:t xml:space="preserve">제8부 · 상태·마감·참고문헌</w:t>
-      </w:r>
-    </w:p>
-    <w:bookmarkStart w:id="333" w:name="서베이-상태-마감-재개-안내"/>
+        <w:t xml:space="preserve">제8부 · 라이선스·상태·마감·참고문헌</w:t>
+      </w:r>
+    </w:p>
+    <w:bookmarkStart w:id="336" w:name="라이선스-보안컴플라이언스-검토"/>
     <w:p>
       <w:pPr>
         <w:pStyle w:val="Heading2"/>
       </w:pPr>
       <w:r>
-        <w:t xml:space="preserve">90 · 서베이 상태 · 마감 · 재개 안내</w:t>
+        <w:t xml:space="preserve">91 · 라이선스 · 보안/컴플라이언스 검토</w:t>
       </w:r>
     </w:p>
     <w:p>
@@ -32952,7 +32952,7 @@
         <w:pStyle w:val="FirstParagraph"/>
       </w:pPr>
       <w:r>
-        <w:t xml:space="preserve">colibri 서베이의 최종 상태를 정리한다.</w:t>
+        <w:t xml:space="preserve">질문: colibri로 쓰는 sLLM은</w:t>
       </w:r>
       <w:r>
         <w:t xml:space="preserve"> </w:t>
@@ -32962,6 +32962,1522 @@
           <w:b/>
           <w:bCs/>
         </w:rPr>
+        <w:t xml:space="preserve">MoE 스트리밍 가능 모델</w:t>
+      </w:r>
+      <w:r>
+        <w:t xml:space="preserve">이어야 하므로 Gemma(Dense)는 불가 — 맞다. 그리고</w:t>
+      </w:r>
+      <w:r>
+        <w:t xml:space="preserve"> </w:t>
+      </w:r>
+      <w:r>
+        <w:rPr>
+          <w:b/>
+          <w:bCs/>
+        </w:rPr>
+        <w:t xml:space="preserve">GLM 모델은 보안 적합 라이선스 발급이 가능한가?</w:t>
+      </w:r>
+    </w:p>
+    <w:bookmarkStart w:id="326" w:name="요약-3줄-13"/>
+    <w:p>
+      <w:pPr>
+        <w:pStyle w:val="Heading3"/>
+      </w:pPr>
+      <w:r>
+        <w:t xml:space="preserve">요약 (3줄)</w:t>
+      </w:r>
+    </w:p>
+    <w:p>
+      <w:pPr>
+        <w:pStyle w:val="Compact"/>
+        <w:numPr>
+          <w:ilvl w:val="0"/>
+          <w:numId w:val="1208"/>
+        </w:numPr>
+      </w:pPr>
+      <w:r>
+        <w:rPr>
+          <w:b/>
+          <w:bCs/>
+        </w:rPr>
+        <w:t xml:space="preserve">라이선스</w:t>
+      </w:r>
+      <w:r>
+        <w:rPr>
+          <w:b/>
+          <w:bCs/>
+        </w:rPr>
+        <w:t xml:space="preserve"> </w:t>
+      </w:r>
+      <w:r>
+        <w:rPr>
+          <w:b/>
+          <w:bCs/>
+        </w:rPr>
+        <w:t xml:space="preserve">“발급”</w:t>
+      </w:r>
+      <w:r>
+        <w:rPr>
+          <w:b/>
+          <w:bCs/>
+        </w:rPr>
+        <w:t xml:space="preserve">은 불필요하다.</w:t>
+      </w:r>
+      <w:r>
+        <w:t xml:space="preserve"> </w:t>
+      </w:r>
+      <w:r>
+        <w:t xml:space="preserve">GLM-5.2 가중치는</w:t>
+      </w:r>
+      <w:r>
+        <w:t xml:space="preserve"> </w:t>
+      </w:r>
+      <w:r>
+        <w:rPr>
+          <w:b/>
+          <w:bCs/>
+        </w:rPr>
+        <w:t xml:space="preserve">표준 MIT</w:t>
+      </w:r>
+      <w:r>
+        <w:t xml:space="preserve">(무수정, 수용조항·지역제한 없음), colibri 엔진은</w:t>
+      </w:r>
+      <w:r>
+        <w:t xml:space="preserve"> </w:t>
+      </w:r>
+      <w:r>
+        <w:rPr>
+          <w:b/>
+          <w:bCs/>
+        </w:rPr>
+        <w:t xml:space="preserve">Apache-2.0</w:t>
+      </w:r>
+      <w:r>
+        <w:t xml:space="preserve"> </w:t>
+      </w:r>
+      <w:r>
+        <w:t xml:space="preserve">— 둘 다</w:t>
+      </w:r>
+      <w:r>
+        <w:t xml:space="preserve"> </w:t>
+      </w:r>
+      <w:r>
+        <w:rPr>
+          <w:b/>
+          <w:bCs/>
+        </w:rPr>
+        <w:t xml:space="preserve">자체호스팅·수정·상업·재배포 허용</w:t>
+      </w:r>
+      <w:r>
+        <w:t xml:space="preserve">. 게이팅/승인 절차가 없다.</w:t>
+      </w:r>
+    </w:p>
+    <w:p>
+      <w:pPr>
+        <w:pStyle w:val="Compact"/>
+        <w:numPr>
+          <w:ilvl w:val="0"/>
+          <w:numId w:val="1208"/>
+        </w:numPr>
+      </w:pPr>
+      <w:r>
+        <w:t xml:space="preserve">보안 관점 최대 강점:</w:t>
+      </w:r>
+      <w:r>
+        <w:t xml:space="preserve"> </w:t>
+      </w:r>
+      <w:r>
+        <w:rPr>
+          <w:b/>
+          <w:bCs/>
+        </w:rPr>
+        <w:t xml:space="preserve">완전 오프라인/에어갭 자체호스팅 → 데이터 미유출</w:t>
+      </w:r>
+      <w:r>
+        <w:t xml:space="preserve">. colibri는 텔레메트리 없는 C 엔진, vLLM도 온프레 가능.</w:t>
+      </w:r>
+    </w:p>
+    <w:p>
+      <w:pPr>
+        <w:pStyle w:val="Compact"/>
+        <w:numPr>
+          <w:ilvl w:val="0"/>
+          <w:numId w:val="1208"/>
+        </w:numPr>
+      </w:pPr>
+      <w:r>
+        <w:t xml:space="preserve">단,</w:t>
+      </w:r>
+      <w:r>
+        <w:t xml:space="preserve"> </w:t>
+      </w:r>
+      <w:r>
+        <w:rPr>
+          <w:b/>
+          <w:bCs/>
+        </w:rPr>
+        <w:t xml:space="preserve">라이선스가 컴플라이언스를 완결하지 않는다</w:t>
+      </w:r>
+      <w:r>
+        <w:t xml:space="preserve">: (1)</w:t>
+      </w:r>
+      <w:r>
+        <w:t xml:space="preserve"> </w:t>
+      </w:r>
+      <w:r>
+        <w:rPr>
+          <w:b/>
+          <w:bCs/>
+        </w:rPr>
+        <w:t xml:space="preserve">원산지(중국 Zhipu AI)</w:t>
+      </w:r>
+      <w:r>
+        <w:t xml:space="preserve"> </w:t>
+      </w:r>
+      <w:r>
+        <w:t xml:space="preserve">규제, (2)</w:t>
+      </w:r>
+      <w:r>
+        <w:t xml:space="preserve"> </w:t>
+      </w:r>
+      <w:r>
+        <w:rPr>
+          <w:b/>
+          <w:bCs/>
+        </w:rPr>
+        <w:t xml:space="preserve">무보증·무면책(AS IS)</w:t>
+      </w:r>
+      <w:r>
+        <w:t xml:space="preserve">, (3) 가중치 무결성/행동 감사 — 세 가지는 별도 검토 필요.</w:t>
+      </w:r>
+    </w:p>
+    <w:bookmarkEnd w:id="326"/>
+    <w:bookmarkStart w:id="327" w:name="라이선스-사실관계-검증됨"/>
+    <w:p>
+      <w:pPr>
+        <w:pStyle w:val="Heading3"/>
+      </w:pPr>
+      <w:r>
+        <w:t xml:space="preserve">1. 라이선스 사실관계 (검증됨)</w:t>
+      </w:r>
+    </w:p>
+    <w:tbl>
+      <w:tblPr>
+        <w:tblStyle w:val="Table"/>
+        <w:tblW w:type="pct" w:w="5000"/>
+        <w:tblLayout w:type="fixed"/>
+        <w:tblLook w:firstRow="1" w:lastRow="0" w:firstColumn="0" w:lastColumn="0" w:noHBand="0" w:noVBand="0" w:val="0020"/>
+      </w:tblPr>
+      <w:tblGrid>
+        <w:gridCol w:w="1980"/>
+        <w:gridCol w:w="1980"/>
+        <w:gridCol w:w="1980"/>
+        <w:gridCol w:w="1980"/>
+      </w:tblGrid>
+      <w:tr>
+        <w:trPr>
+          <w:tblHeader w:val="on"/>
+        </w:trPr>
+        <w:tc>
+          <w:tcPr/>
+          <w:p>
+            <w:pPr>
+              <w:pStyle w:val="Compact"/>
+            </w:pPr>
+            <w:r>
+              <w:t xml:space="preserve">구성요소</w:t>
+            </w:r>
+          </w:p>
+        </w:tc>
+        <w:tc>
+          <w:tcPr/>
+          <w:p>
+            <w:pPr>
+              <w:pStyle w:val="Compact"/>
+            </w:pPr>
+            <w:r>
+              <w:t xml:space="preserve">라이선스</w:t>
+            </w:r>
+          </w:p>
+        </w:tc>
+        <w:tc>
+          <w:tcPr/>
+          <w:p>
+            <w:pPr>
+              <w:pStyle w:val="Compact"/>
+            </w:pPr>
+            <w:r>
+              <w:t xml:space="preserve">근거</w:t>
+            </w:r>
+          </w:p>
+        </w:tc>
+        <w:tc>
+          <w:tcPr/>
+          <w:p>
+            <w:pPr>
+              <w:pStyle w:val="Compact"/>
+            </w:pPr>
+            <w:r>
+              <w:t xml:space="preserve">의미</w:t>
+            </w:r>
+          </w:p>
+        </w:tc>
+      </w:tr>
+      <w:tr>
+        <w:tc>
+          <w:tcPr/>
+          <w:p>
+            <w:pPr>
+              <w:pStyle w:val="Compact"/>
+            </w:pPr>
+            <w:r>
+              <w:rPr>
+                <w:b/>
+                <w:bCs/>
+              </w:rPr>
+              <w:t xml:space="preserve">GLM-5.2 가중치</w:t>
+            </w:r>
+          </w:p>
+        </w:tc>
+        <w:tc>
+          <w:tcPr/>
+          <w:p>
+            <w:pPr>
+              <w:pStyle w:val="Compact"/>
+            </w:pPr>
+            <w:r>
+              <w:rPr>
+                <w:b/>
+                <w:bCs/>
+              </w:rPr>
+              <w:t xml:space="preserve">MIT</w:t>
+            </w:r>
+            <w:r>
+              <w:t xml:space="preserve"> </w:t>
+            </w:r>
+            <w:r>
+              <w:t xml:space="preserve">(© 2026 Zhipu AI)</w:t>
+            </w:r>
+          </w:p>
+        </w:tc>
+        <w:tc>
+          <w:tcPr/>
+          <w:p>
+            <w:pPr>
+              <w:pStyle w:val="Compact"/>
+            </w:pPr>
+            <w:r>
+              <w:t xml:space="preserve">HF</w:t>
+            </w:r>
+            <w:r>
+              <w:t xml:space="preserve"> </w:t>
+            </w:r>
+            <w:r>
+              <w:rPr>
+                <w:rStyle w:val="VerbatimChar"/>
+              </w:rPr>
+              <w:t xml:space="preserve">zai-org/GLM-5.2/LICENSE</w:t>
+            </w:r>
+          </w:p>
+        </w:tc>
+        <w:tc>
+          <w:tcPr/>
+          <w:p>
+            <w:pPr>
+              <w:pStyle w:val="Compact"/>
+            </w:pPr>
+            <w:r>
+              <w:t xml:space="preserve">상업·수정·재배포·자체호스팅 자유, copyleft 없음</w:t>
+            </w:r>
+          </w:p>
+        </w:tc>
+      </w:tr>
+      <w:tr>
+        <w:tc>
+          <w:tcPr/>
+          <w:p>
+            <w:pPr>
+              <w:pStyle w:val="Compact"/>
+            </w:pPr>
+            <w:r>
+              <w:rPr>
+                <w:b/>
+                <w:bCs/>
+              </w:rPr>
+              <w:t xml:space="preserve">colibri 엔진</w:t>
+            </w:r>
+          </w:p>
+        </w:tc>
+        <w:tc>
+          <w:tcPr/>
+          <w:p>
+            <w:pPr>
+              <w:pStyle w:val="Compact"/>
+            </w:pPr>
+            <w:r>
+              <w:rPr>
+                <w:b/>
+                <w:bCs/>
+              </w:rPr>
+              <w:t xml:space="preserve">Apache-2.0</w:t>
+            </w:r>
+          </w:p>
+        </w:tc>
+        <w:tc>
+          <w:tcPr/>
+          <w:p>
+            <w:pPr>
+              <w:pStyle w:val="Compact"/>
+            </w:pPr>
+            <w:r>
+              <w:rPr>
+                <w:rStyle w:val="VerbatimChar"/>
+              </w:rPr>
+              <w:t xml:space="preserve">external/colibri/LICENSE</w:t>
+            </w:r>
+            <w:r>
+              <w:t xml:space="preserve">, README</w:t>
+            </w:r>
+            <w:r>
+              <w:t xml:space="preserve"> </w:t>
+            </w:r>
+            <w:r>
+              <w:t xml:space="preserve">“License”</w:t>
+            </w:r>
+          </w:p>
+        </w:tc>
+        <w:tc>
+          <w:tcPr/>
+          <w:p>
+            <w:pPr>
+              <w:pStyle w:val="Compact"/>
+            </w:pPr>
+            <w:r>
+              <w:t xml:space="preserve">특허 grant 포함, NOTICE·변경고지 의무</w:t>
+            </w:r>
+          </w:p>
+        </w:tc>
+      </w:tr>
+      <w:tr>
+        <w:tc>
+          <w:tcPr/>
+          <w:p>
+            <w:pPr>
+              <w:pStyle w:val="Compact"/>
+            </w:pPr>
+            <w:r>
+              <w:t xml:space="preserve">GLM-4.5/4.6/5/5.1</w:t>
+            </w:r>
+          </w:p>
+        </w:tc>
+        <w:tc>
+          <w:tcPr/>
+          <w:p>
+            <w:pPr>
+              <w:pStyle w:val="Compact"/>
+            </w:pPr>
+            <w:r>
+              <w:t xml:space="preserve">MIT</w:t>
+            </w:r>
+          </w:p>
+        </w:tc>
+        <w:tc>
+          <w:tcPr/>
+          <w:p>
+            <w:pPr>
+              <w:pStyle w:val="Compact"/>
+            </w:pPr>
+            <w:r>
+              <w:t xml:space="preserve">Z.ai 계열 정책</w:t>
+            </w:r>
+          </w:p>
+        </w:tc>
+        <w:tc>
+          <w:tcPr/>
+          <w:p>
+            <w:pPr>
+              <w:pStyle w:val="Compact"/>
+            </w:pPr>
+            <w:r>
+              <w:t xml:space="preserve">동일(오픈웨이트 전략 일관)</w:t>
+            </w:r>
+          </w:p>
+        </w:tc>
+      </w:tr>
+    </w:tbl>
+    <w:p>
+      <w:pPr>
+        <w:pStyle w:val="Compact"/>
+        <w:numPr>
+          <w:ilvl w:val="0"/>
+          <w:numId w:val="1209"/>
+        </w:numPr>
+      </w:pPr>
+      <w:r>
+        <w:rPr>
+          <w:b/>
+          <w:bCs/>
+        </w:rPr>
+        <w:t xml:space="preserve">“발급”</w:t>
+      </w:r>
+      <w:r>
+        <w:rPr>
+          <w:b/>
+          <w:bCs/>
+        </w:rPr>
+        <w:t xml:space="preserve"> </w:t>
+      </w:r>
+      <w:r>
+        <w:rPr>
+          <w:b/>
+          <w:bCs/>
+        </w:rPr>
+        <w:t xml:space="preserve">개념 없음</w:t>
+      </w:r>
+      <w:r>
+        <w:t xml:space="preserve">: Llama류의 사용신청/MAU 상한/수용정책(AUP) 애드덤이</w:t>
+      </w:r>
+      <w:r>
+        <w:t xml:space="preserve"> </w:t>
+      </w:r>
+      <w:r>
+        <w:rPr>
+          <w:b/>
+          <w:bCs/>
+        </w:rPr>
+        <w:t xml:space="preserve">없다</w:t>
+      </w:r>
+      <w:r>
+        <w:t xml:space="preserve">. MIT는 저작권·허가 고지만 유지하면 끝. Apache-2.0는 NOTICE 유지 + 변경 명시 + 특허조항.</w:t>
+      </w:r>
+    </w:p>
+    <w:bookmarkEnd w:id="327"/>
+    <w:bookmarkStart w:id="328" w:name="보안-관점-강점-왜-자체호스팅이-유리한가"/>
+    <w:p>
+      <w:pPr>
+        <w:pStyle w:val="Heading3"/>
+      </w:pPr>
+      <w:r>
+        <w:t xml:space="preserve">2. 보안 관점 강점 (왜 자체호스팅이 유리한가)</w:t>
+      </w:r>
+    </w:p>
+    <w:p>
+      <w:pPr>
+        <w:pStyle w:val="Compact"/>
+        <w:numPr>
+          <w:ilvl w:val="0"/>
+          <w:numId w:val="1210"/>
+        </w:numPr>
+      </w:pPr>
+      <w:r>
+        <w:rPr>
+          <w:b/>
+          <w:bCs/>
+        </w:rPr>
+        <w:t xml:space="preserve">데이터 거버넌스</w:t>
+      </w:r>
+      <w:r>
+        <w:t xml:space="preserve">: 가중치를 내부 인프라에 내려받아</w:t>
+      </w:r>
+      <w:r>
+        <w:t xml:space="preserve"> </w:t>
+      </w:r>
+      <w:r>
+        <w:rPr>
+          <w:b/>
+          <w:bCs/>
+        </w:rPr>
+        <w:t xml:space="preserve">에어갭/온프레</w:t>
+      </w:r>
+      <w:r>
+        <w:t xml:space="preserve">로 구동 → 질의·문서가</w:t>
+      </w:r>
+      <w:r>
+        <w:t xml:space="preserve"> </w:t>
+      </w:r>
+      <w:r>
+        <w:rPr>
+          <w:b/>
+          <w:bCs/>
+        </w:rPr>
+        <w:t xml:space="preserve">외부로 나가지 않음</w:t>
+      </w:r>
+      <w:r>
+        <w:t xml:space="preserve">. 폐쇄망 요건 충족 가능.</w:t>
+      </w:r>
+    </w:p>
+    <w:p>
+      <w:pPr>
+        <w:pStyle w:val="Compact"/>
+        <w:numPr>
+          <w:ilvl w:val="0"/>
+          <w:numId w:val="1210"/>
+        </w:numPr>
+      </w:pPr>
+      <w:r>
+        <w:rPr>
+          <w:b/>
+          <w:bCs/>
+        </w:rPr>
+        <w:t xml:space="preserve">벤더 종속 없음</w:t>
+      </w:r>
+      <w:r>
+        <w:t xml:space="preserve">: API 요금·정책 변경·서비스 종료 리스크 제거(오픈웨이트 소유).</w:t>
+      </w:r>
+    </w:p>
+    <w:p>
+      <w:pPr>
+        <w:pStyle w:val="Compact"/>
+        <w:numPr>
+          <w:ilvl w:val="0"/>
+          <w:numId w:val="1210"/>
+        </w:numPr>
+      </w:pPr>
+      <w:r>
+        <w:rPr>
+          <w:b/>
+          <w:bCs/>
+        </w:rPr>
+        <w:t xml:space="preserve">무결성 안전 포맷</w:t>
+      </w:r>
+      <w:r>
+        <w:t xml:space="preserve">: GLM-5.2는</w:t>
+      </w:r>
+      <w:r>
+        <w:t xml:space="preserve"> </w:t>
+      </w:r>
+      <w:r>
+        <w:rPr>
+          <w:b/>
+          <w:bCs/>
+        </w:rPr>
+        <w:t xml:space="preserve">safetensors</w:t>
+      </w:r>
+      <w:r>
+        <w:t xml:space="preserve">(코드 실행 없는 텐서 컨테이너)로 배포 → pickle류 임의코드 위험 없음. 체크섬 검증 권장.</w:t>
+      </w:r>
+    </w:p>
+    <w:p>
+      <w:pPr>
+        <w:pStyle w:val="Compact"/>
+        <w:numPr>
+          <w:ilvl w:val="0"/>
+          <w:numId w:val="1210"/>
+        </w:numPr>
+      </w:pPr>
+      <w:r>
+        <w:rPr>
+          <w:b/>
+          <w:bCs/>
+        </w:rPr>
+        <w:t xml:space="preserve">엔진 투명성</w:t>
+      </w:r>
+      <w:r>
+        <w:t xml:space="preserve">: colibri는 소스 공개(Apache) C 엔진 → 감사 가능, 네트워크 콜 없음(오프라인).</w:t>
+      </w:r>
+    </w:p>
+    <w:bookmarkEnd w:id="328"/>
+    <w:bookmarkStart w:id="332" w:name="반드시-별도-검토할-컴플라이언스-항목-라이선스로-해결-안-됨"/>
+    <w:p>
+      <w:pPr>
+        <w:pStyle w:val="Heading3"/>
+      </w:pPr>
+      <w:r>
+        <w:t xml:space="preserve">3. 반드시 별도 검토할 컴플라이언스 항목 (라이선스로 해결 안 됨)</w:t>
+      </w:r>
+    </w:p>
+    <w:p>
+      <w:pPr>
+        <w:pStyle w:val="FirstParagraph"/>
+      </w:pPr>
+      <w:r>
+        <w:drawing>
+          <wp:inline>
+            <wp:extent cx="5486400" cy="8221337"/>
+            <wp:effectExtent b="0" l="0" r="0" t="0"/>
+            <wp:docPr descr="91-licensing-compliance 다이어그램 1" title="" id="330" name="Picture"/>
+            <a:graphic>
+              <a:graphicData uri="http://schemas.openxmlformats.org/drawingml/2006/picture">
+                <pic:pic>
+                  <pic:nvPicPr>
+                    <pic:cNvPr descr="img/91-licensing-compliance-1.png" id="331" name="Picture"/>
+                    <pic:cNvPicPr>
+                      <a:picLocks noChangeArrowheads="1" noChangeAspect="1"/>
+                    </pic:cNvPicPr>
+                  </pic:nvPicPr>
+                  <pic:blipFill>
+                    <a:blip r:embed="rId329"/>
+                    <a:stretch>
+                      <a:fillRect/>
+                    </a:stretch>
+                  </pic:blipFill>
+                  <pic:spPr bwMode="auto">
+                    <a:xfrm>
+                      <a:off x="0" y="0"/>
+                      <a:ext cx="5486400" cy="8221337"/>
+                    </a:xfrm>
+                    <a:prstGeom prst="rect">
+                      <a:avLst/>
+                    </a:prstGeom>
+                    <a:noFill/>
+                    <a:ln w="9525">
+                      <a:noFill/>
+                      <a:headEnd/>
+                      <a:tailEnd/>
+                    </a:ln>
+                  </pic:spPr>
+                </pic:pic>
+              </a:graphicData>
+            </a:graphic>
+          </wp:inline>
+        </w:drawing>
+      </w:r>
+      <w:r>
+        <w:t xml:space="preserve"> </w:t>
+      </w:r>
+      <w:r>
+        <w:t xml:space="preserve">1.</w:t>
+      </w:r>
+      <w:r>
+        <w:t xml:space="preserve"> </w:t>
+      </w:r>
+      <w:r>
+        <w:rPr>
+          <w:b/>
+          <w:bCs/>
+        </w:rPr>
+        <w:t xml:space="preserve">원산지/지정학 규제 (가장 중요)</w:t>
+      </w:r>
+      <w:r>
+        <w:t xml:space="preserve">: Zhipu AI는 중국 기업이다.</w:t>
+      </w:r>
+      <w:r>
+        <w:t xml:space="preserve"> </w:t>
+      </w:r>
+      <w:r>
+        <w:rPr>
+          <w:b/>
+          <w:bCs/>
+        </w:rPr>
+        <w:t xml:space="preserve">정부·국방·금융·규제산업</w:t>
+      </w:r>
+      <w:r>
+        <w:t xml:space="preserve">은 라이선스와 무관하게</w:t>
+      </w:r>
+      <w:r>
+        <w:t xml:space="preserve"> </w:t>
+      </w:r>
+      <w:r>
+        <w:rPr>
+          <w:b/>
+          <w:bCs/>
+        </w:rPr>
+        <w:t xml:space="preserve">모델 원산지 제한</w:t>
+      </w:r>
+      <w:r>
+        <w:t xml:space="preserve">(조달·수출·보안정책)을 둘 수 있다. MIT 허용 ≠ 조직 보안정책 통과. →</w:t>
+      </w:r>
+      <w:r>
+        <w:t xml:space="preserve"> </w:t>
+      </w:r>
+      <w:r>
+        <w:rPr>
+          <w:b/>
+          <w:bCs/>
+        </w:rPr>
+        <w:t xml:space="preserve">법무/보안팀 사전 승인 필수.</w:t>
+      </w:r>
+      <w:r>
+        <w:t xml:space="preserve"> </w:t>
+      </w:r>
+      <w:r>
+        <w:t xml:space="preserve">2.</w:t>
+      </w:r>
+      <w:r>
+        <w:t xml:space="preserve"> </w:t>
+      </w:r>
+      <w:r>
+        <w:rPr>
+          <w:b/>
+          <w:bCs/>
+        </w:rPr>
+        <w:t xml:space="preserve">무보증·무면책(AS IS)</w:t>
+      </w:r>
+      <w:r>
+        <w:t xml:space="preserve">: MIT/Apache 모두</w:t>
+      </w:r>
+      <w:r>
+        <w:t xml:space="preserve"> </w:t>
+      </w:r>
+      <w:r>
+        <w:rPr>
+          <w:b/>
+          <w:bCs/>
+        </w:rPr>
+        <w:t xml:space="preserve">품질보증·IP 침해 면책 없음</w:t>
+      </w:r>
+      <w:r>
+        <w:t xml:space="preserve">. 상용 호스팅 벤더(일부는 IP 면책 제공)와 달리, 학습데이터 관련 IP 클레임 리스크는</w:t>
+      </w:r>
+      <w:r>
+        <w:t xml:space="preserve"> </w:t>
+      </w:r>
+      <w:r>
+        <w:rPr>
+          <w:b/>
+          <w:bCs/>
+        </w:rPr>
+        <w:t xml:space="preserve">도입자가 부담</w:t>
+      </w:r>
+      <w:r>
+        <w:t xml:space="preserve">. 법무 리스크 수용 판단 필요.</w:t>
+      </w:r>
+      <w:r>
+        <w:t xml:space="preserve"> </w:t>
+      </w:r>
+      <w:r>
+        <w:t xml:space="preserve">3.</w:t>
+      </w:r>
+      <w:r>
+        <w:t xml:space="preserve"> </w:t>
+      </w:r>
+      <w:r>
+        <w:rPr>
+          <w:b/>
+          <w:bCs/>
+        </w:rPr>
+        <w:t xml:space="preserve">가중치/행동 감사</w:t>
+      </w:r>
+      <w:r>
+        <w:t xml:space="preserve">: 오픈웨이트도 임베디드 행동(백도어·정렬편향)을 100% 배제 증명은 불가 →</w:t>
+      </w:r>
+      <w:r>
+        <w:t xml:space="preserve"> </w:t>
+      </w:r>
+      <w:r>
+        <w:rPr>
+          <w:b/>
+          <w:bCs/>
+        </w:rPr>
+        <w:t xml:space="preserve">안전성 평가·레드팀·출력 감사</w:t>
+      </w:r>
+      <w:r>
+        <w:t xml:space="preserve"> </w:t>
+      </w:r>
+      <w:r>
+        <w:t xml:space="preserve">권장. (safetensors라 실행형 악성코드 위험은 낮음.)</w:t>
+      </w:r>
+      <w:r>
+        <w:t xml:space="preserve"> </w:t>
+      </w:r>
+      <w:r>
+        <w:t xml:space="preserve">4.</w:t>
+      </w:r>
+      <w:r>
+        <w:t xml:space="preserve"> </w:t>
+      </w:r>
+      <w:r>
+        <w:rPr>
+          <w:b/>
+          <w:bCs/>
+        </w:rPr>
+        <w:t xml:space="preserve">Apache-2.0 의무(엔진)</w:t>
+      </w:r>
+      <w:r>
+        <w:t xml:space="preserve">: colibri 재배포 시</w:t>
+      </w:r>
+      <w:r>
+        <w:t xml:space="preserve"> </w:t>
+      </w:r>
+      <w:r>
+        <w:rPr>
+          <w:b/>
+          <w:bCs/>
+        </w:rPr>
+        <w:t xml:space="preserve">LICENSE/NOTICE 유지, 변경사항 명시</w:t>
+      </w:r>
+      <w:r>
+        <w:t xml:space="preserve">. 사내 사용만이면 부담 적음.</w:t>
+      </w:r>
+    </w:p>
+    <w:bookmarkEnd w:id="332"/>
+    <w:bookmarkStart w:id="333" w:name="원산지가-걸림돌일-때의-대안-colibri-제약과-함께"/>
+    <w:p>
+      <w:pPr>
+        <w:pStyle w:val="Heading3"/>
+      </w:pPr>
+      <w:r>
+        <w:t xml:space="preserve">4. 원산지가 걸림돌일 때의 대안 (colibri 제약과 함께)</w:t>
+      </w:r>
+    </w:p>
+    <w:p>
+      <w:pPr>
+        <w:pStyle w:val="FirstParagraph"/>
+      </w:pPr>
+      <w:r>
+        <w:t xml:space="preserve">colibri는</w:t>
+      </w:r>
+      <w:r>
+        <w:t xml:space="preserve"> </w:t>
+      </w:r>
+      <w:r>
+        <w:rPr>
+          <w:b/>
+          <w:bCs/>
+        </w:rPr>
+        <w:t xml:space="preserve">MoE 전용</w:t>
+      </w:r>
+      <w:r>
+        <w:t xml:space="preserve">이므로 대안도 MoE여야 한다:</w:t>
+      </w:r>
+    </w:p>
+    <w:tbl>
+      <w:tblPr>
+        <w:tblStyle w:val="Table"/>
+        <w:tblW w:type="pct" w:w="5000"/>
+        <w:tblLayout w:type="fixed"/>
+        <w:tblLook w:firstRow="1" w:lastRow="0" w:firstColumn="0" w:lastColumn="0" w:noHBand="0" w:noVBand="0" w:val="0020"/>
+      </w:tblPr>
+      <w:tblGrid>
+        <w:gridCol w:w="1584"/>
+        <w:gridCol w:w="1584"/>
+        <w:gridCol w:w="1584"/>
+        <w:gridCol w:w="1584"/>
+        <w:gridCol w:w="1584"/>
+      </w:tblGrid>
+      <w:tr>
+        <w:trPr>
+          <w:tblHeader w:val="on"/>
+        </w:trPr>
+        <w:tc>
+          <w:tcPr/>
+          <w:p>
+            <w:pPr>
+              <w:pStyle w:val="Compact"/>
+            </w:pPr>
+            <w:r>
+              <w:t xml:space="preserve">대안</w:t>
+            </w:r>
+          </w:p>
+        </w:tc>
+        <w:tc>
+          <w:tcPr/>
+          <w:p>
+            <w:pPr>
+              <w:pStyle w:val="Compact"/>
+            </w:pPr>
+            <w:r>
+              <w:t xml:space="preserve">라이선스</w:t>
+            </w:r>
+          </w:p>
+        </w:tc>
+        <w:tc>
+          <w:tcPr/>
+          <w:p>
+            <w:pPr>
+              <w:pStyle w:val="Compact"/>
+            </w:pPr>
+            <w:r>
+              <w:t xml:space="preserve">원산지</w:t>
+            </w:r>
+          </w:p>
+        </w:tc>
+        <w:tc>
+          <w:tcPr/>
+          <w:p>
+            <w:pPr>
+              <w:pStyle w:val="Compact"/>
+            </w:pPr>
+            <w:r>
+              <w:t xml:space="preserve">colibri 적합</w:t>
+            </w:r>
+          </w:p>
+        </w:tc>
+        <w:tc>
+          <w:tcPr/>
+          <w:p>
+            <w:pPr>
+              <w:pStyle w:val="Compact"/>
+            </w:pPr>
+            <w:r>
+              <w:t xml:space="preserve">비고</w:t>
+            </w:r>
+          </w:p>
+        </w:tc>
+      </w:tr>
+      <w:tr>
+        <w:tc>
+          <w:tcPr/>
+          <w:p>
+            <w:pPr>
+              <w:pStyle w:val="Compact"/>
+            </w:pPr>
+            <w:r>
+              <w:rPr>
+                <w:b/>
+                <w:bCs/>
+              </w:rPr>
+              <w:t xml:space="preserve">gpt-oss-120b/20b</w:t>
+            </w:r>
+          </w:p>
+        </w:tc>
+        <w:tc>
+          <w:tcPr/>
+          <w:p>
+            <w:pPr>
+              <w:pStyle w:val="Compact"/>
+            </w:pPr>
+            <w:r>
+              <w:rPr>
+                <w:b/>
+                <w:bCs/>
+              </w:rPr>
+              <w:t xml:space="preserve">Apache-2.0</w:t>
+            </w:r>
+          </w:p>
+        </w:tc>
+        <w:tc>
+          <w:tcPr/>
+          <w:p>
+            <w:pPr>
+              <w:pStyle w:val="Compact"/>
+            </w:pPr>
+            <w:r>
+              <w:t xml:space="preserve">미국(OpenAI)</w:t>
+            </w:r>
+          </w:p>
+        </w:tc>
+        <w:tc>
+          <w:tcPr/>
+          <w:p>
+            <w:pPr>
+              <w:pStyle w:val="Compact"/>
+            </w:pPr>
+            <w:r>
+              <w:t xml:space="preserve">MoE ✅ (어댑터 필요)</w:t>
+            </w:r>
+          </w:p>
+        </w:tc>
+        <w:tc>
+          <w:tcPr/>
+          <w:p>
+            <w:pPr>
+              <w:pStyle w:val="Compact"/>
+            </w:pPr>
+            <w:r>
+              <w:t xml:space="preserve">원산지 민감 조직의 1순위 대체</w:t>
+            </w:r>
+          </w:p>
+        </w:tc>
+      </w:tr>
+      <w:tr>
+        <w:tc>
+          <w:tcPr/>
+          <w:p>
+            <w:pPr>
+              <w:pStyle w:val="Compact"/>
+            </w:pPr>
+            <w:r>
+              <w:t xml:space="preserve">Qwen3 계열 MoE</w:t>
+            </w:r>
+          </w:p>
+        </w:tc>
+        <w:tc>
+          <w:tcPr/>
+          <w:p>
+            <w:pPr>
+              <w:pStyle w:val="Compact"/>
+            </w:pPr>
+            <w:r>
+              <w:t xml:space="preserve">Apache-2.0</w:t>
+            </w:r>
+          </w:p>
+        </w:tc>
+        <w:tc>
+          <w:tcPr/>
+          <w:p>
+            <w:pPr>
+              <w:pStyle w:val="Compact"/>
+            </w:pPr>
+            <w:r>
+              <w:t xml:space="preserve">중국(Alibaba)</w:t>
+            </w:r>
+          </w:p>
+        </w:tc>
+        <w:tc>
+          <w:tcPr/>
+          <w:p>
+            <w:pPr>
+              <w:pStyle w:val="Compact"/>
+            </w:pPr>
+            <w:r>
+              <w:t xml:space="preserve">MoE ✅</w:t>
+            </w:r>
+          </w:p>
+        </w:tc>
+        <w:tc>
+          <w:tcPr/>
+          <w:p>
+            <w:pPr>
+              <w:pStyle w:val="Compact"/>
+            </w:pPr>
+            <w:r>
+              <w:t xml:space="preserve">원산지 이슈는 GLM과 동일</w:t>
+            </w:r>
+          </w:p>
+        </w:tc>
+      </w:tr>
+      <w:tr>
+        <w:tc>
+          <w:tcPr/>
+          <w:p>
+            <w:pPr>
+              <w:pStyle w:val="Compact"/>
+            </w:pPr>
+            <w:r>
+              <w:t xml:space="preserve">Gemma 4</w:t>
+            </w:r>
+          </w:p>
+        </w:tc>
+        <w:tc>
+          <w:tcPr/>
+          <w:p>
+            <w:pPr>
+              <w:pStyle w:val="Compact"/>
+            </w:pPr>
+            <w:r>
+              <w:t xml:space="preserve">Apache-2.0</w:t>
+            </w:r>
+          </w:p>
+        </w:tc>
+        <w:tc>
+          <w:tcPr/>
+          <w:p>
+            <w:pPr>
+              <w:pStyle w:val="Compact"/>
+            </w:pPr>
+            <w:r>
+              <w:t xml:space="preserve">미국(Google)</w:t>
+            </w:r>
+          </w:p>
+        </w:tc>
+        <w:tc>
+          <w:tcPr/>
+          <w:p>
+            <w:pPr>
+              <w:pStyle w:val="Compact"/>
+            </w:pPr>
+            <w:r>
+              <w:t xml:space="preserve">❌ Dense/일부 26B-MoE</w:t>
+            </w:r>
+          </w:p>
+        </w:tc>
+        <w:tc>
+          <w:tcPr/>
+          <w:p>
+            <w:pPr>
+              <w:pStyle w:val="Compact"/>
+            </w:pPr>
+            <w:r>
+              <w:t xml:space="preserve">26B-A4B만 MoE, 그러나 소형이라 스트리밍 실익 낮음</w:t>
+            </w:r>
+          </w:p>
+        </w:tc>
+      </w:tr>
+      <w:tr>
+        <w:tc>
+          <w:tcPr/>
+          <w:p>
+            <w:pPr>
+              <w:pStyle w:val="Compact"/>
+            </w:pPr>
+            <w:r>
+              <w:t xml:space="preserve">Llama 4 (MoE)</w:t>
+            </w:r>
+          </w:p>
+        </w:tc>
+        <w:tc>
+          <w:tcPr/>
+          <w:p>
+            <w:pPr>
+              <w:pStyle w:val="Compact"/>
+            </w:pPr>
+            <w:r>
+              <w:t xml:space="preserve">Llama Community(제한)</w:t>
+            </w:r>
+          </w:p>
+        </w:tc>
+        <w:tc>
+          <w:tcPr/>
+          <w:p>
+            <w:pPr>
+              <w:pStyle w:val="Compact"/>
+            </w:pPr>
+            <w:r>
+              <w:t xml:space="preserve">미국(Meta)</w:t>
+            </w:r>
+          </w:p>
+        </w:tc>
+        <w:tc>
+          <w:tcPr/>
+          <w:p>
+            <w:pPr>
+              <w:pStyle w:val="Compact"/>
+            </w:pPr>
+            <w:r>
+              <w:t xml:space="preserve">MoE ✅</w:t>
+            </w:r>
+          </w:p>
+        </w:tc>
+        <w:tc>
+          <w:tcPr/>
+          <w:p>
+            <w:pPr>
+              <w:pStyle w:val="Compact"/>
+            </w:pPr>
+            <w:r>
+              <w:t xml:space="preserve">MAU&gt;700M 제한·AUP 있음</w:t>
+            </w:r>
+          </w:p>
+        </w:tc>
+      </w:tr>
+    </w:tbl>
+    <w:p>
+      <w:pPr>
+        <w:pStyle w:val="BodyText"/>
+      </w:pPr>
+      <w:r>
+        <w:t xml:space="preserve">→</w:t>
+      </w:r>
+      <w:r>
+        <w:t xml:space="preserve"> </w:t>
+      </w:r>
+      <w:r>
+        <w:rPr>
+          <w:b/>
+          <w:bCs/>
+        </w:rPr>
+        <w:t xml:space="preserve">원산지 무제한이면 GLM-5.2(MIT)가 최적</w:t>
+      </w:r>
+      <w:r>
+        <w:t xml:space="preserve">(라이선스·성능·colibri 정합).</w:t>
+      </w:r>
+      <w:r>
+        <w:t xml:space="preserve"> </w:t>
+      </w:r>
+      <w:r>
+        <w:rPr>
+          <w:b/>
+          <w:bCs/>
+        </w:rPr>
+        <w:t xml:space="preserve">중국산 제한이 있으면 gpt-oss(Apache, MoE)</w:t>
+      </w:r>
+      <w:r>
+        <w:t xml:space="preserve"> </w:t>
+      </w:r>
+      <w:r>
+        <w:t xml:space="preserve">가 colibri 유지하면서 원산지 리스크를 해소하는 최선 대체(단 엔진 어댑터 필요,</w:t>
+      </w:r>
+      <w:r>
+        <w:t xml:space="preserve"> </w:t>
+      </w:r>
+      <w:r>
+        <w:rPr>
+          <w:rStyle w:val="VerbatimChar"/>
+        </w:rPr>
+        <w:t xml:space="preserve">docs/61/82</w:t>
+      </w:r>
+      <w:r>
+        <w:t xml:space="preserve">).</w:t>
+      </w:r>
+    </w:p>
+    <w:bookmarkEnd w:id="333"/>
+    <w:bookmarkStart w:id="334" w:name="결론-경영보안-판단"/>
+    <w:p>
+      <w:pPr>
+        <w:pStyle w:val="Heading3"/>
+      </w:pPr>
+      <w:r>
+        <w:t xml:space="preserve">5. 결론 (경영/보안 판단)</w:t>
+      </w:r>
+    </w:p>
+    <w:p>
+      <w:pPr>
+        <w:pStyle w:val="Compact"/>
+        <w:numPr>
+          <w:ilvl w:val="0"/>
+          <w:numId w:val="1211"/>
+        </w:numPr>
+      </w:pPr>
+      <w:r>
+        <w:rPr>
+          <w:b/>
+          <w:bCs/>
+        </w:rPr>
+        <w:t xml:space="preserve">GLM-5.2는</w:t>
+      </w:r>
+      <w:r>
+        <w:rPr>
+          <w:b/>
+          <w:bCs/>
+        </w:rPr>
+        <w:t xml:space="preserve"> </w:t>
+      </w:r>
+      <w:r>
+        <w:rPr>
+          <w:b/>
+          <w:bCs/>
+        </w:rPr>
+        <w:t xml:space="preserve">“보안 적합 라이선스”</w:t>
+      </w:r>
+      <w:r>
+        <w:rPr>
+          <w:b/>
+          <w:bCs/>
+        </w:rPr>
+        <w:t xml:space="preserve">를 이미 갖췄다</w:t>
+      </w:r>
+      <w:r>
+        <w:t xml:space="preserve"> </w:t>
+      </w:r>
+      <w:r>
+        <w:t xml:space="preserve">— MIT(무수정·무제한), 발급/승인 절차 불필요,</w:t>
+      </w:r>
+      <w:r>
+        <w:t xml:space="preserve"> </w:t>
+      </w:r>
+      <w:r>
+        <w:rPr>
+          <w:b/>
+          <w:bCs/>
+        </w:rPr>
+        <w:t xml:space="preserve">자체호스팅으로 데이터 미유출</w:t>
+      </w:r>
+      <w:r>
+        <w:t xml:space="preserve">. 엔진(colibri)도 Apache-2.0로 문제없음.</w:t>
+      </w:r>
+    </w:p>
+    <w:p>
+      <w:pPr>
+        <w:pStyle w:val="Compact"/>
+        <w:numPr>
+          <w:ilvl w:val="0"/>
+          <w:numId w:val="1211"/>
+        </w:numPr>
+      </w:pPr>
+      <w:r>
+        <w:t xml:space="preserve">그러나</w:t>
+      </w:r>
+      <w:r>
+        <w:t xml:space="preserve"> </w:t>
+      </w:r>
+      <w:r>
+        <w:rPr>
+          <w:b/>
+          <w:bCs/>
+        </w:rPr>
+        <w:t xml:space="preserve">라이선스 통과 ≠ 보안 승인</w:t>
+      </w:r>
+      <w:r>
+        <w:t xml:space="preserve">. 실제 도입 게이트는 (a)</w:t>
+      </w:r>
+      <w:r>
+        <w:t xml:space="preserve"> </w:t>
+      </w:r>
+      <w:r>
+        <w:rPr>
+          <w:b/>
+          <w:bCs/>
+        </w:rPr>
+        <w:t xml:space="preserve">중국 원산지 정책</w:t>
+      </w:r>
+      <w:r>
+        <w:t xml:space="preserve">, (b)</w:t>
+      </w:r>
+      <w:r>
+        <w:t xml:space="preserve"> </w:t>
+      </w:r>
+      <w:r>
+        <w:rPr>
+          <w:b/>
+          <w:bCs/>
+        </w:rPr>
+        <w:t xml:space="preserve">무면책 리스크 수용</w:t>
+      </w:r>
+      <w:r>
+        <w:t xml:space="preserve">, (c)</w:t>
+      </w:r>
+      <w:r>
+        <w:t xml:space="preserve"> </w:t>
+      </w:r>
+      <w:r>
+        <w:rPr>
+          <w:b/>
+          <w:bCs/>
+        </w:rPr>
+        <w:t xml:space="preserve">무결성/행동 감사</w:t>
+      </w:r>
+      <w:r>
+        <w:t xml:space="preserve"> </w:t>
+      </w:r>
+      <w:r>
+        <w:t xml:space="preserve">세 가지다.</w:t>
+      </w:r>
+    </w:p>
+    <w:p>
+      <w:pPr>
+        <w:pStyle w:val="Compact"/>
+        <w:numPr>
+          <w:ilvl w:val="0"/>
+          <w:numId w:val="1211"/>
+        </w:numPr>
+      </w:pPr>
+      <w:r>
+        <w:t xml:space="preserve">원산지 제약이 없으면 GLM-5.2 진행, 있으면</w:t>
+      </w:r>
+      <w:r>
+        <w:t xml:space="preserve"> </w:t>
+      </w:r>
+      <w:r>
+        <w:rPr>
+          <w:b/>
+          <w:bCs/>
+        </w:rPr>
+        <w:t xml:space="preserve">gpt-oss(Apache·MoE·미국)</w:t>
+      </w:r>
+      <w:r>
+        <w:t xml:space="preserve"> </w:t>
+      </w:r>
+      <w:r>
+        <w:t xml:space="preserve">로 colibri를 유지한 채 대체 검토.</w:t>
+      </w:r>
+    </w:p>
+    <w:bookmarkEnd w:id="334"/>
+    <w:bookmarkStart w:id="335" w:name="출처-17"/>
+    <w:p>
+      <w:pPr>
+        <w:pStyle w:val="Heading3"/>
+      </w:pPr>
+      <w:r>
+        <w:t xml:space="preserve">출처</w:t>
+      </w:r>
+    </w:p>
+    <w:p>
+      <w:pPr>
+        <w:pStyle w:val="Compact"/>
+        <w:numPr>
+          <w:ilvl w:val="0"/>
+          <w:numId w:val="1212"/>
+        </w:numPr>
+      </w:pPr>
+      <w:r>
+        <w:t xml:space="preserve">GLM-5.2 LICENSE(MIT): https://huggingface.co/zai-org/GLM-5.2/blob/main/LICENSE</w:t>
+      </w:r>
+    </w:p>
+    <w:p>
+      <w:pPr>
+        <w:pStyle w:val="Compact"/>
+        <w:numPr>
+          <w:ilvl w:val="0"/>
+          <w:numId w:val="1212"/>
+        </w:numPr>
+      </w:pPr>
+      <w:r>
+        <w:t xml:space="preserve">colibri LICENSE(Apache-2.0):</w:t>
+      </w:r>
+      <w:r>
+        <w:t xml:space="preserve"> </w:t>
+      </w:r>
+      <w:r>
+        <w:rPr>
+          <w:rStyle w:val="VerbatimChar"/>
+        </w:rPr>
+        <w:t xml:space="preserve">external/colibri/LICENSE</w:t>
+      </w:r>
+      <w:r>
+        <w:t xml:space="preserve">,</w:t>
+      </w:r>
+      <w:r>
+        <w:t xml:space="preserve"> </w:t>
+      </w:r>
+      <w:r>
+        <w:rPr>
+          <w:rStyle w:val="VerbatimChar"/>
+        </w:rPr>
+        <w:t xml:space="preserve">external/colibri/README.md</w:t>
+      </w:r>
+    </w:p>
+    <w:p>
+      <w:pPr>
+        <w:pStyle w:val="Compact"/>
+        <w:numPr>
+          <w:ilvl w:val="0"/>
+          <w:numId w:val="1212"/>
+        </w:numPr>
+      </w:pPr>
+      <w:r>
+        <w:t xml:space="preserve">모델 원산지/라이선스:</w:t>
+      </w:r>
+      <w:r>
+        <w:t xml:space="preserve"> </w:t>
+      </w:r>
+      <w:r>
+        <w:rPr>
+          <w:rStyle w:val="VerbatimChar"/>
+        </w:rPr>
+        <w:t xml:space="preserve">docs/80</w:t>
+      </w:r>
+      <w:r>
+        <w:t xml:space="preserve">,</w:t>
+      </w:r>
+      <w:r>
+        <w:t xml:space="preserve"> </w:t>
+      </w:r>
+      <w:r>
+        <w:rPr>
+          <w:rStyle w:val="VerbatimChar"/>
+        </w:rPr>
+        <w:t xml:space="preserve">docs/62</w:t>
+      </w:r>
+      <w:r>
+        <w:t xml:space="preserve">,</w:t>
+      </w:r>
+      <w:r>
+        <w:t xml:space="preserve"> </w:t>
+      </w:r>
+      <w:r>
+        <w:rPr>
+          <w:rStyle w:val="VerbatimChar"/>
+        </w:rPr>
+        <w:t xml:space="preserve">data/topics/apply-gpt-oss/</w:t>
+      </w:r>
+    </w:p>
+    <w:bookmarkEnd w:id="335"/>
+    <w:bookmarkEnd w:id="336"/>
+    <w:bookmarkStart w:id="344" w:name="서베이-상태-마감-재개-안내"/>
+    <w:p>
+      <w:pPr>
+        <w:pStyle w:val="Heading2"/>
+      </w:pPr>
+      <w:r>
+        <w:t xml:space="preserve">90 · 서베이 상태 · 마감 · 재개 안내</w:t>
+      </w:r>
+    </w:p>
+    <w:p>
+      <w:pPr>
+        <w:pStyle w:val="FirstParagraph"/>
+      </w:pPr>
+      <w:r>
+        <w:t xml:space="preserve">colibri 서베이의 최종 상태를 정리한다.</w:t>
+      </w:r>
+      <w:r>
+        <w:t xml:space="preserve"> </w:t>
+      </w:r>
+      <w:r>
+        <w:rPr>
+          <w:b/>
+          <w:bCs/>
+        </w:rPr>
         <w:t xml:space="preserve">문서/코드 산출물은 완결</w:t>
       </w:r>
       <w:r>
@@ -32984,7 +34500,7 @@
         <w:t xml:space="preserve">서버 성능 실측(정성 주장에 실수치를 채우는 보강)이다.</w:t>
       </w:r>
     </w:p>
-    <w:bookmarkStart w:id="326" w:name="완료-상태-status"/>
+    <w:bookmarkStart w:id="337" w:name="완료-상태-status"/>
     <w:p>
       <w:pPr>
         <w:pStyle w:val="Heading3"/>
@@ -33589,8 +35105,8 @@
         </w:tc>
       </w:tr>
     </w:tbl>
-    <w:bookmarkEnd w:id="326"/>
-    <w:bookmarkStart w:id="327" w:name="검증으로-증명된-사실-근거-있는-결론"/>
+    <w:bookmarkEnd w:id="337"/>
+    <w:bookmarkStart w:id="338" w:name="검증으로-증명된-사실-근거-있는-결론"/>
     <w:p>
       <w:pPr>
         <w:pStyle w:val="Heading3"/>
@@ -33604,7 +35120,7 @@
         <w:pStyle w:val="Compact"/>
         <w:numPr>
           <w:ilvl w:val="0"/>
-          <w:numId w:val="1208"/>
+          <w:numId w:val="1213"/>
         </w:numPr>
       </w:pPr>
       <w:r>
@@ -33644,7 +35160,7 @@
         <w:pStyle w:val="Compact"/>
         <w:numPr>
           <w:ilvl w:val="0"/>
-          <w:numId w:val="1208"/>
+          <w:numId w:val="1213"/>
         </w:numPr>
       </w:pPr>
       <w:r>
@@ -33672,7 +35188,7 @@
         <w:pStyle w:val="Compact"/>
         <w:numPr>
           <w:ilvl w:val="0"/>
-          <w:numId w:val="1208"/>
+          <w:numId w:val="1213"/>
         </w:numPr>
       </w:pPr>
       <w:r>
@@ -33724,7 +35240,7 @@
         <w:pStyle w:val="Compact"/>
         <w:numPr>
           <w:ilvl w:val="0"/>
-          <w:numId w:val="1208"/>
+          <w:numId w:val="1213"/>
         </w:numPr>
       </w:pPr>
       <w:r>
@@ -33771,8 +35287,8 @@
         <w:t xml:space="preserve">)</w:t>
       </w:r>
     </w:p>
-    <w:bookmarkEnd w:id="327"/>
-    <w:bookmarkStart w:id="329" w:name="보류된-유일한-항목-서버-성능-실측-선택"/>
+    <w:bookmarkEnd w:id="338"/>
+    <w:bookmarkStart w:id="340" w:name="보류된-유일한-항목-서버-성능-실측-선택"/>
     <w:p>
       <w:pPr>
         <w:pStyle w:val="Heading3"/>
@@ -33786,7 +35302,7 @@
         <w:pStyle w:val="Compact"/>
         <w:numPr>
           <w:ilvl w:val="0"/>
-          <w:numId w:val="1209"/>
+          <w:numId w:val="1214"/>
         </w:numPr>
       </w:pPr>
       <w:r>
@@ -33821,7 +35337,7 @@
         <w:pStyle w:val="Compact"/>
         <w:numPr>
           <w:ilvl w:val="0"/>
-          <w:numId w:val="1209"/>
+          <w:numId w:val="1214"/>
         </w:numPr>
       </w:pPr>
       <w:r>
@@ -33861,7 +35377,7 @@
         <w:pStyle w:val="Compact"/>
         <w:numPr>
           <w:ilvl w:val="0"/>
-          <w:numId w:val="1209"/>
+          <w:numId w:val="1214"/>
         </w:numPr>
       </w:pPr>
       <w:r>
@@ -33888,7 +35404,7 @@
         <w:t xml:space="preserve">(CPU+디스크+RAM만). ThinkFlow 서버는 CPU 97% idle·RAM 228GB 여유 → GPU가 꽉 차 있어도 무방해.</w:t>
       </w:r>
     </w:p>
-    <w:bookmarkStart w:id="328" w:name="재개-절차-원할-때"/>
+    <w:bookmarkStart w:id="339" w:name="재개-절차-원할-때"/>
     <w:p>
       <w:pPr>
         <w:pStyle w:val="Heading4"/>
@@ -33935,9 +35451,9 @@
         <w:t xml:space="preserve"># 결과(cap, hit_rate, tok/s, expert-disk, RSS)를 docs/40·50 표에 추기.</w:t>
       </w:r>
     </w:p>
-    <w:bookmarkEnd w:id="328"/>
-    <w:bookmarkEnd w:id="329"/>
-    <w:bookmarkStart w:id="330" w:name="thinkflow-스왑-운영자-실행-대기"/>
+    <w:bookmarkEnd w:id="339"/>
+    <w:bookmarkEnd w:id="340"/>
+    <w:bookmarkStart w:id="341" w:name="thinkflow-스왑-운영자-실행-대기"/>
     <w:p>
       <w:pPr>
         <w:pStyle w:val="Heading3"/>
@@ -33951,7 +35467,7 @@
         <w:pStyle w:val="Compact"/>
         <w:numPr>
           <w:ilvl w:val="0"/>
-          <w:numId w:val="1210"/>
+          <w:numId w:val="1215"/>
         </w:numPr>
       </w:pPr>
       <w:r>
@@ -33990,7 +35506,7 @@
         <w:pStyle w:val="Compact"/>
         <w:numPr>
           <w:ilvl w:val="0"/>
-          <w:numId w:val="1210"/>
+          <w:numId w:val="1215"/>
         </w:numPr>
       </w:pPr>
       <w:r>
@@ -34024,8 +35540,8 @@
         <w:t xml:space="preserve">→ KPI A/B → 확정/롤백.</w:t>
       </w:r>
     </w:p>
-    <w:bookmarkEnd w:id="330"/>
-    <w:bookmarkStart w:id="331" w:name="저장소-지도-요약"/>
+    <w:bookmarkEnd w:id="341"/>
+    <w:bookmarkStart w:id="342" w:name="저장소-지도-요약"/>
     <w:p>
       <w:pPr>
         <w:pStyle w:val="Heading3"/>
@@ -34039,7 +35555,7 @@
         <w:pStyle w:val="Compact"/>
         <w:numPr>
           <w:ilvl w:val="0"/>
-          <w:numId w:val="1211"/>
+          <w:numId w:val="1216"/>
         </w:numPr>
       </w:pPr>
       <w:r>
@@ -34060,7 +35576,7 @@
         <w:pStyle w:val="Compact"/>
         <w:numPr>
           <w:ilvl w:val="0"/>
-          <w:numId w:val="1211"/>
+          <w:numId w:val="1216"/>
         </w:numPr>
       </w:pPr>
       <w:r>
@@ -34078,7 +35594,7 @@
         <w:pStyle w:val="Compact"/>
         <w:numPr>
           <w:ilvl w:val="0"/>
-          <w:numId w:val="1211"/>
+          <w:numId w:val="1216"/>
         </w:numPr>
       </w:pPr>
       <w:r>
@@ -34096,7 +35612,7 @@
         <w:pStyle w:val="Compact"/>
         <w:numPr>
           <w:ilvl w:val="0"/>
-          <w:numId w:val="1211"/>
+          <w:numId w:val="1216"/>
         </w:numPr>
       </w:pPr>
       <w:r>
@@ -34121,8 +35637,8 @@
         <w:t xml:space="preserve">).</w:t>
       </w:r>
     </w:p>
-    <w:bookmarkEnd w:id="331"/>
-    <w:bookmarkStart w:id="332" w:name="결론-1"/>
+    <w:bookmarkEnd w:id="342"/>
+    <w:bookmarkStart w:id="343" w:name="결론-1"/>
     <w:p>
       <w:pPr>
         <w:pStyle w:val="Heading3"/>
@@ -34165,9 +35681,9 @@
         <w:t xml:space="preserve">로, 준비물(스크립트·런북·프로토콜)이 모두 갖춰져 필요 시 즉시 재개 가능하다.</w:t>
       </w:r>
     </w:p>
-    <w:bookmarkEnd w:id="332"/>
-    <w:bookmarkEnd w:id="333"/>
-    <w:bookmarkStart w:id="339" w:name="참고문헌-references"/>
+    <w:bookmarkEnd w:id="343"/>
+    <w:bookmarkEnd w:id="344"/>
+    <w:bookmarkStart w:id="350" w:name="참고문헌-references"/>
     <w:p>
       <w:pPr>
         <w:pStyle w:val="Heading2"/>
@@ -34176,7 +35692,7 @@
         <w:t xml:space="preserve">99 · 참고문헌 (References)</w:t>
       </w:r>
     </w:p>
-    <w:bookmarkStart w:id="334" w:name="colibrì"/>
+    <w:bookmarkStart w:id="345" w:name="colibrì"/>
     <w:p>
       <w:pPr>
         <w:pStyle w:val="Heading3"/>
@@ -34190,7 +35706,7 @@
         <w:pStyle w:val="Compact"/>
         <w:numPr>
           <w:ilvl w:val="0"/>
-          <w:numId w:val="1212"/>
+          <w:numId w:val="1217"/>
         </w:numPr>
       </w:pPr>
       <w:r>
@@ -34245,7 +35761,7 @@
         <w:pStyle w:val="Compact"/>
         <w:numPr>
           <w:ilvl w:val="0"/>
-          <w:numId w:val="1212"/>
+          <w:numId w:val="1217"/>
         </w:numPr>
       </w:pPr>
       <w:r>
@@ -34278,7 +35794,7 @@
         <w:pStyle w:val="Compact"/>
         <w:numPr>
           <w:ilvl w:val="0"/>
-          <w:numId w:val="1212"/>
+          <w:numId w:val="1217"/>
         </w:numPr>
       </w:pPr>
       <w:r>
@@ -34297,8 +35813,8 @@
         <w:t xml:space="preserve">(DEV). https://dev.to/jamilxt/colibri-running-a-744b-ai-model-on-your-laptop-dpp</w:t>
       </w:r>
     </w:p>
-    <w:bookmarkEnd w:id="334"/>
-    <w:bookmarkStart w:id="335" w:name="glm-5.2"/>
+    <w:bookmarkEnd w:id="345"/>
+    <w:bookmarkStart w:id="346" w:name="glm-5.2"/>
     <w:p>
       <w:pPr>
         <w:pStyle w:val="Heading3"/>
@@ -34312,7 +35828,7 @@
         <w:pStyle w:val="Compact"/>
         <w:numPr>
           <w:ilvl w:val="0"/>
-          <w:numId w:val="1213"/>
+          <w:numId w:val="1218"/>
         </w:numPr>
       </w:pPr>
       <w:r>
@@ -34340,7 +35856,7 @@
         <w:pStyle w:val="Compact"/>
         <w:numPr>
           <w:ilvl w:val="0"/>
-          <w:numId w:val="1213"/>
+          <w:numId w:val="1218"/>
         </w:numPr>
       </w:pPr>
       <w:r>
@@ -34368,7 +35884,7 @@
         <w:pStyle w:val="Compact"/>
         <w:numPr>
           <w:ilvl w:val="0"/>
-          <w:numId w:val="1213"/>
+          <w:numId w:val="1218"/>
         </w:numPr>
       </w:pPr>
       <w:r>
@@ -34389,15 +35905,15 @@
         <w:pStyle w:val="Compact"/>
         <w:numPr>
           <w:ilvl w:val="0"/>
-          <w:numId w:val="1213"/>
+          <w:numId w:val="1218"/>
         </w:numPr>
       </w:pPr>
       <w:r>
         <w:t xml:space="preserve">IndexShare, arXiv:2603.12201</w:t>
       </w:r>
     </w:p>
-    <w:bookmarkEnd w:id="335"/>
-    <w:bookmarkStart w:id="336" w:name="mla-kv-압축"/>
+    <w:bookmarkEnd w:id="346"/>
+    <w:bookmarkStart w:id="347" w:name="mla-kv-압축"/>
     <w:p>
       <w:pPr>
         <w:pStyle w:val="Heading3"/>
@@ -34411,7 +35927,7 @@
         <w:pStyle w:val="Compact"/>
         <w:numPr>
           <w:ilvl w:val="0"/>
-          <w:numId w:val="1214"/>
+          <w:numId w:val="1219"/>
         </w:numPr>
       </w:pPr>
       <w:r>
@@ -34448,7 +35964,7 @@
         <w:pStyle w:val="Compact"/>
         <w:numPr>
           <w:ilvl w:val="0"/>
-          <w:numId w:val="1214"/>
+          <w:numId w:val="1219"/>
         </w:numPr>
       </w:pPr>
       <w:r>
@@ -34479,7 +35995,7 @@
         <w:pStyle w:val="Compact"/>
         <w:numPr>
           <w:ilvl w:val="0"/>
-          <w:numId w:val="1214"/>
+          <w:numId w:val="1219"/>
         </w:numPr>
       </w:pPr>
       <w:r>
@@ -34500,7 +36016,7 @@
         <w:pStyle w:val="Compact"/>
         <w:numPr>
           <w:ilvl w:val="0"/>
-          <w:numId w:val="1214"/>
+          <w:numId w:val="1219"/>
         </w:numPr>
       </w:pPr>
       <w:r>
@@ -34516,8 +36032,8 @@
         <w:t xml:space="preserve">. https://xuquant.com/en/posts/foundation-models/deepseek_series1_mla/</w:t>
       </w:r>
     </w:p>
-    <w:bookmarkEnd w:id="336"/>
-    <w:bookmarkStart w:id="337" w:name="moe-offloading-스트리밍"/>
+    <w:bookmarkEnd w:id="347"/>
+    <w:bookmarkStart w:id="348" w:name="moe-offloading-스트리밍"/>
     <w:p>
       <w:pPr>
         <w:pStyle w:val="Heading3"/>
@@ -34531,7 +36047,7 @@
         <w:pStyle w:val="Compact"/>
         <w:numPr>
           <w:ilvl w:val="0"/>
-          <w:numId w:val="1215"/>
+          <w:numId w:val="1220"/>
         </w:numPr>
       </w:pPr>
       <w:r>
@@ -34561,7 +36077,7 @@
         <w:pStyle w:val="Compact"/>
         <w:numPr>
           <w:ilvl w:val="0"/>
-          <w:numId w:val="1215"/>
+          <w:numId w:val="1220"/>
         </w:numPr>
       </w:pPr>
       <w:r>
@@ -34585,7 +36101,7 @@
         <w:pStyle w:val="Compact"/>
         <w:numPr>
           <w:ilvl w:val="0"/>
-          <w:numId w:val="1215"/>
+          <w:numId w:val="1220"/>
         </w:numPr>
       </w:pPr>
       <w:r>
@@ -34604,8 +36120,8 @@
         <w:t xml:space="preserve">data/topics/moe-streaming/paper-dali-arxiv-2602.03495.txt</w:t>
       </w:r>
     </w:p>
-    <w:bookmarkEnd w:id="337"/>
-    <w:bookmarkStart w:id="338" w:name="speculative-decoding-mtp-1"/>
+    <w:bookmarkEnd w:id="348"/>
+    <w:bookmarkStart w:id="349" w:name="speculative-decoding-mtp-1"/>
     <w:p>
       <w:pPr>
         <w:pStyle w:val="Heading3"/>
@@ -34619,7 +36135,7 @@
         <w:pStyle w:val="Compact"/>
         <w:numPr>
           <w:ilvl w:val="0"/>
-          <w:numId w:val="1216"/>
+          <w:numId w:val="1221"/>
         </w:numPr>
       </w:pPr>
       <w:r>
@@ -34653,7 +36169,7 @@
         <w:pStyle w:val="Compact"/>
         <w:numPr>
           <w:ilvl w:val="0"/>
-          <w:numId w:val="1216"/>
+          <w:numId w:val="1221"/>
         </w:numPr>
       </w:pPr>
       <w:r>
@@ -34686,7 +36202,7 @@
         <w:pStyle w:val="Compact"/>
         <w:numPr>
           <w:ilvl w:val="0"/>
-          <w:numId w:val="1216"/>
+          <w:numId w:val="1221"/>
         </w:numPr>
       </w:pPr>
       <w:r>
@@ -34702,9 +36218,9 @@
         <w:t xml:space="preserve">. https://developer.nvidia.com/blog/an-introduction-to-speculative-decoding-for-reducing-latency-in-ai-inference/</w:t>
       </w:r>
     </w:p>
-    <w:bookmarkEnd w:id="338"/>
-    <w:bookmarkEnd w:id="339"/>
-    <w:bookmarkEnd w:id="340"/>
+    <w:bookmarkEnd w:id="349"/>
+    <w:bookmarkEnd w:id="350"/>
+    <w:bookmarkEnd w:id="351"/>
     <w:sectPr>
       <w:headerReference r:id="rId9" w:type="default"/>
       <w:footerReference r:id="rId10" w:type="default"/>
@@ -36333,6 +37849,15 @@
     <w:abstractNumId w:val="991"/>
   </w:num>
   <w:num w:numId="1208">
+    <w:abstractNumId w:val="991"/>
+  </w:num>
+  <w:num w:numId="1209">
+    <w:abstractNumId w:val="991"/>
+  </w:num>
+  <w:num w:numId="1210">
+    <w:abstractNumId w:val="991"/>
+  </w:num>
+  <w:num w:numId="1211">
     <w:abstractNumId w:val="99411"/>
     <w:lvlOverride w:ilvl="0">
       <w:startOverride w:val="1"/>
@@ -36362,20 +37887,38 @@
       <w:startOverride w:val="1"/>
     </w:lvlOverride>
   </w:num>
-  <w:num w:numId="1209">
-    <w:abstractNumId w:val="991"/>
-  </w:num>
-  <w:num w:numId="1210">
-    <w:abstractNumId w:val="991"/>
-  </w:num>
-  <w:num w:numId="1211">
-    <w:abstractNumId w:val="991"/>
-  </w:num>
   <w:num w:numId="1212">
     <w:abstractNumId w:val="991"/>
   </w:num>
   <w:num w:numId="1213">
-    <w:abstractNumId w:val="991"/>
+    <w:abstractNumId w:val="99411"/>
+    <w:lvlOverride w:ilvl="0">
+      <w:startOverride w:val="1"/>
+    </w:lvlOverride>
+    <w:lvlOverride w:ilvl="1">
+      <w:startOverride w:val="1"/>
+    </w:lvlOverride>
+    <w:lvlOverride w:ilvl="2">
+      <w:startOverride w:val="1"/>
+    </w:lvlOverride>
+    <w:lvlOverride w:ilvl="3">
+      <w:startOverride w:val="1"/>
+    </w:lvlOverride>
+    <w:lvlOverride w:ilvl="4">
+      <w:startOverride w:val="1"/>
+    </w:lvlOverride>
+    <w:lvlOverride w:ilvl="5">
+      <w:startOverride w:val="1"/>
+    </w:lvlOverride>
+    <w:lvlOverride w:ilvl="6">
+      <w:startOverride w:val="1"/>
+    </w:lvlOverride>
+    <w:lvlOverride w:ilvl="7">
+      <w:startOverride w:val="1"/>
+    </w:lvlOverride>
+    <w:lvlOverride w:ilvl="8">
+      <w:startOverride w:val="1"/>
+    </w:lvlOverride>
   </w:num>
   <w:num w:numId="1214">
     <w:abstractNumId w:val="991"/>
@@ -36384,6 +37927,21 @@
     <w:abstractNumId w:val="991"/>
   </w:num>
   <w:num w:numId="1216">
+    <w:abstractNumId w:val="991"/>
+  </w:num>
+  <w:num w:numId="1217">
+    <w:abstractNumId w:val="991"/>
+  </w:num>
+  <w:num w:numId="1218">
+    <w:abstractNumId w:val="991"/>
+  </w:num>
+  <w:num w:numId="1219">
+    <w:abstractNumId w:val="991"/>
+  </w:num>
+  <w:num w:numId="1220">
+    <w:abstractNumId w:val="991"/>
+  </w:num>
+  <w:num w:numId="1221">
     <w:abstractNumId w:val="991"/>
   </w:num>
 </w:numbering>

</xml_diff>